<commit_message>
Updated dashboard with latest version
</commit_message>
<xml_diff>
--- a/draft1.docx
+++ b/draft1.docx
@@ -19,7 +19,13 @@
       </w:r>
       <w:proofErr w:type="spellEnd"/>
       <w:r>
-        <w:t xml:space="preserve"> run dashboard.py</w:t>
+        <w:t xml:space="preserve"> run dashboard</w:t>
+      </w:r>
+      <w:r>
+        <w:t>_1</w:t>
+      </w:r>
+      <w:r>
+        <w:t>.py</w:t>
       </w:r>
     </w:p>
     <w:p>
@@ -6466,6 +6472,177 @@
           <w14:ligatures w14:val="none"/>
         </w:rPr>
         <w:t>)</w:t>
+      </w:r>
+    </w:p>
+    <w:p/>
+    <w:p>
+      <w:pPr>
+        <w:pStyle w:val="NormalWeb"/>
+      </w:pPr>
+      <w:r>
+        <w:t xml:space="preserve">1. Introduce the problem - Online job board has been one of the main platform people get hired. And how to write you cv according to the job description can be tricky. </w:t>
+      </w:r>
+      <w:r>
+        <w:t>So,</w:t>
+      </w:r>
+      <w:r>
+        <w:t xml:space="preserve"> use deep learning to analyze the job posting data, looking for what exactly those jobs want could be helpful </w:t>
+      </w:r>
+    </w:p>
+    <w:p>
+      <w:pPr>
+        <w:pStyle w:val="NormalWeb"/>
+      </w:pPr>
+      <w:r>
+        <w:t xml:space="preserve">2. Introduce our dataset - Linked in job posting dataset. We filtered for those written in English, about 1300 datapoints. </w:t>
+      </w:r>
+      <w:r>
+        <w:t>(could show a picture of the original dataset)</w:t>
+      </w:r>
+    </w:p>
+    <w:p>
+      <w:pPr>
+        <w:pStyle w:val="NormalWeb"/>
+      </w:pPr>
+      <w:r>
+        <w:t>3. What model we are using, introducing the model</w:t>
+      </w:r>
+      <w:r>
+        <w:t xml:space="preserve"> </w:t>
+      </w:r>
+      <w:r>
+        <w:t xml:space="preserve">(details) - We use anthropic </w:t>
+      </w:r>
+      <w:proofErr w:type="spellStart"/>
+      <w:r>
+        <w:t>api</w:t>
+      </w:r>
+      <w:proofErr w:type="spellEnd"/>
+      <w:r>
+        <w:t xml:space="preserve"> for skill keyword extraction, and all-MiniLM-L6-v2 sentence transformer. (introduce how the transformer works) </w:t>
+      </w:r>
+    </w:p>
+    <w:p>
+      <w:pPr>
+        <w:pStyle w:val="NormalWeb"/>
+      </w:pPr>
+      <w:r>
+        <w:t>4. why we choose the model. - could be generated by ChatGPT</w:t>
+      </w:r>
+      <w:r>
+        <w:t xml:space="preserve">. Generally, the transformer is good for embedding and semantic analysis, and anthropic </w:t>
+      </w:r>
+      <w:proofErr w:type="spellStart"/>
+      <w:r>
+        <w:t>api</w:t>
+      </w:r>
+      <w:proofErr w:type="spellEnd"/>
+      <w:r>
+        <w:t xml:space="preserve"> is good at dealing with unstructured data.</w:t>
+      </w:r>
+    </w:p>
+    <w:p>
+      <w:pPr>
+        <w:pStyle w:val="NormalWeb"/>
+      </w:pPr>
+      <w:r>
+        <w:t xml:space="preserve">5. The methodology </w:t>
+      </w:r>
+    </w:p>
+    <w:p>
+      <w:pPr>
+        <w:pStyle w:val="NormalWeb"/>
+        <w:numPr>
+          <w:ilvl w:val="0"/>
+          <w:numId w:val="1"/>
+        </w:numPr>
+      </w:pPr>
+      <w:r>
+        <w:t xml:space="preserve">First use anthropic </w:t>
+      </w:r>
+      <w:proofErr w:type="spellStart"/>
+      <w:r>
+        <w:t>api</w:t>
+      </w:r>
+      <w:proofErr w:type="spellEnd"/>
+      <w:r>
+        <w:t xml:space="preserve"> to extract skill keywords</w:t>
+      </w:r>
+    </w:p>
+    <w:p>
+      <w:pPr>
+        <w:pStyle w:val="NormalWeb"/>
+        <w:numPr>
+          <w:ilvl w:val="0"/>
+          <w:numId w:val="1"/>
+        </w:numPr>
+      </w:pPr>
+      <w:r>
+        <w:t>Then calculate embedding for each skill extracted</w:t>
+      </w:r>
+    </w:p>
+    <w:p>
+      <w:pPr>
+        <w:pStyle w:val="NormalWeb"/>
+        <w:numPr>
+          <w:ilvl w:val="0"/>
+          <w:numId w:val="1"/>
+        </w:numPr>
+      </w:pPr>
+      <w:r>
+        <w:t>Each job would also get an embedding, which his calculated taking all its extracted skill as a whole and fed to the sentence transformer</w:t>
+      </w:r>
+    </w:p>
+    <w:p>
+      <w:pPr>
+        <w:pStyle w:val="NormalWeb"/>
+        <w:numPr>
+          <w:ilvl w:val="0"/>
+          <w:numId w:val="1"/>
+        </w:numPr>
+      </w:pPr>
+      <w:r>
+        <w:t>Then comes to the dashboard, user can type or choose a job, which will return them the top 10 similar jobs based on calculating the cosine similarity of these jobs’ embedding</w:t>
+      </w:r>
+    </w:p>
+    <w:p>
+      <w:pPr>
+        <w:pStyle w:val="NormalWeb"/>
+        <w:numPr>
+          <w:ilvl w:val="0"/>
+          <w:numId w:val="1"/>
+        </w:numPr>
+      </w:pPr>
+      <w:r>
+        <w:t>Also, users can type or choose one or multiple skills, which will return them the top 10 relevant jobs based on calculating the cosine similarity between the job and skill. If multiple skills are entered, we take the average.</w:t>
+      </w:r>
+    </w:p>
+    <w:p>
+      <w:pPr>
+        <w:pStyle w:val="NormalWeb"/>
+      </w:pPr>
+    </w:p>
+    <w:p>
+      <w:pPr>
+        <w:pStyle w:val="NormalWeb"/>
+      </w:pPr>
+      <w:r>
+        <w:lastRenderedPageBreak/>
+        <w:t xml:space="preserve">6. The training details, like how many epochs we had </w:t>
+      </w:r>
+      <w:r>
+        <w:t>– could refer to the code, include some training details</w:t>
+      </w:r>
+    </w:p>
+    <w:p>
+      <w:pPr>
+        <w:pStyle w:val="NormalWeb"/>
+      </w:pPr>
+      <w:r>
+        <w:t>7.</w:t>
+      </w:r>
+      <w:r>
+        <w:t xml:space="preserve"> Evaluation (which I haven't done, but we can potentially add that) </w:t>
       </w:r>
     </w:p>
     <w:p/>
@@ -6477,6 +6654,127 @@
     </w:sectPr>
   </w:body>
 </w:document>
+</file>
+
+<file path=word/numbering.xml><?xml version="1.0" encoding="utf-8"?>
+<w:numbering xmlns:wpc="http://schemas.microsoft.com/office/word/2010/wordprocessingCanvas" xmlns:cx="http://schemas.microsoft.com/office/drawing/2014/chartex" xmlns:cx1="http://schemas.microsoft.com/office/drawing/2015/9/8/chartex" xmlns:cx2="http://schemas.microsoft.com/office/drawing/2015/10/21/chartex" xmlns:cx3="http://schemas.microsoft.com/office/drawing/2016/5/9/chartex" xmlns:cx4="http://schemas.microsoft.com/office/drawing/2016/5/10/chartex" xmlns:cx5="http://schemas.microsoft.com/office/drawing/2016/5/11/chartex" xmlns:cx6="http://schemas.microsoft.com/office/drawing/2016/5/12/chartex" xmlns:cx7="http://schemas.microsoft.com/office/drawing/2016/5/13/chartex" xmlns:cx8="http://schemas.microsoft.com/office/drawing/2016/5/14/chartex" xmlns:mc="http://schemas.openxmlformats.org/markup-compatibility/2006" xmlns:aink="http://schemas.microsoft.com/office/drawing/2016/ink" xmlns:am3d="http://schemas.microsoft.com/office/drawing/2017/model3d" xmlns:o="urn:schemas-microsoft-com:office:office" xmlns:oel="http://schemas.microsoft.com/office/2019/extlst" xmlns:r="http://schemas.openxmlformats.org/officeDocument/2006/relationships" xmlns:m="http://schemas.openxmlformats.org/officeDocument/2006/math" xmlns:v="urn:schemas-microsoft-com:vml" xmlns:wp14="http://schemas.microsoft.com/office/word/2010/wordprocessingDrawing" xmlns:wp="http://schemas.openxmlformats.org/drawingml/2006/wordprocessingDrawing" xmlns:w10="urn:schemas-microsoft-com:office:word" xmlns:w="http://schemas.openxmlformats.org/wordprocessingml/2006/main" xmlns:w14="http://schemas.microsoft.com/office/word/2010/wordml" xmlns:w15="http://schemas.microsoft.com/office/word/2012/wordml" xmlns:w16cex="http://schemas.microsoft.com/office/word/2018/wordml/cex" xmlns:w16cid="http://schemas.microsoft.com/office/word/2016/wordml/cid" xmlns:w16="http://schemas.microsoft.com/office/word/2018/wordml" xmlns:w16du="http://schemas.microsoft.com/office/word/2023/wordml/word16du" xmlns:w16sdtdh="http://schemas.microsoft.com/office/word/2020/wordml/sdtdatahash" xmlns:w16sdtfl="http://schemas.microsoft.com/office/word/2024/wordml/sdtformatlock" xmlns:w16se="http://schemas.microsoft.com/office/word/2015/wordml/symex" xmlns:wpg="http://schemas.microsoft.com/office/word/2010/wordprocessingGroup" xmlns:wpi="http://schemas.microsoft.com/office/word/2010/wordprocessingInk" xmlns:wne="http://schemas.microsoft.com/office/word/2006/wordml" xmlns:wps="http://schemas.microsoft.com/office/word/2010/wordprocessingShape" mc:Ignorable="w14 w15 w16se w16cid w16 w16cex w16sdtdh w16sdtfl w16du wp14">
+  <w:abstractNum w:abstractNumId="0" w15:restartNumberingAfterBreak="0">
+    <w:nsid w:val="3E103D61"/>
+    <w:multiLevelType w:val="hybridMultilevel"/>
+    <w:tmpl w:val="D8943072"/>
+    <w:lvl w:ilvl="0" w:tplc="04090001">
+      <w:start w:val="1"/>
+      <w:numFmt w:val="bullet"/>
+      <w:lvlText w:val=""/>
+      <w:lvlJc w:val="left"/>
+      <w:pPr>
+        <w:ind w:left="720" w:hanging="360"/>
+      </w:pPr>
+      <w:rPr>
+        <w:rFonts w:ascii="Symbol" w:hAnsi="Symbol" w:hint="default"/>
+      </w:rPr>
+    </w:lvl>
+    <w:lvl w:ilvl="1" w:tplc="04090003" w:tentative="1">
+      <w:start w:val="1"/>
+      <w:numFmt w:val="bullet"/>
+      <w:lvlText w:val="o"/>
+      <w:lvlJc w:val="left"/>
+      <w:pPr>
+        <w:ind w:left="1440" w:hanging="360"/>
+      </w:pPr>
+      <w:rPr>
+        <w:rFonts w:ascii="Courier New" w:hAnsi="Courier New" w:cs="Courier New" w:hint="default"/>
+      </w:rPr>
+    </w:lvl>
+    <w:lvl w:ilvl="2" w:tplc="04090005" w:tentative="1">
+      <w:start w:val="1"/>
+      <w:numFmt w:val="bullet"/>
+      <w:lvlText w:val=""/>
+      <w:lvlJc w:val="left"/>
+      <w:pPr>
+        <w:ind w:left="2160" w:hanging="360"/>
+      </w:pPr>
+      <w:rPr>
+        <w:rFonts w:ascii="Wingdings" w:hAnsi="Wingdings" w:hint="default"/>
+      </w:rPr>
+    </w:lvl>
+    <w:lvl w:ilvl="3" w:tplc="04090001" w:tentative="1">
+      <w:start w:val="1"/>
+      <w:numFmt w:val="bullet"/>
+      <w:lvlText w:val=""/>
+      <w:lvlJc w:val="left"/>
+      <w:pPr>
+        <w:ind w:left="2880" w:hanging="360"/>
+      </w:pPr>
+      <w:rPr>
+        <w:rFonts w:ascii="Symbol" w:hAnsi="Symbol" w:hint="default"/>
+      </w:rPr>
+    </w:lvl>
+    <w:lvl w:ilvl="4" w:tplc="04090003" w:tentative="1">
+      <w:start w:val="1"/>
+      <w:numFmt w:val="bullet"/>
+      <w:lvlText w:val="o"/>
+      <w:lvlJc w:val="left"/>
+      <w:pPr>
+        <w:ind w:left="3600" w:hanging="360"/>
+      </w:pPr>
+      <w:rPr>
+        <w:rFonts w:ascii="Courier New" w:hAnsi="Courier New" w:cs="Courier New" w:hint="default"/>
+      </w:rPr>
+    </w:lvl>
+    <w:lvl w:ilvl="5" w:tplc="04090005" w:tentative="1">
+      <w:start w:val="1"/>
+      <w:numFmt w:val="bullet"/>
+      <w:lvlText w:val=""/>
+      <w:lvlJc w:val="left"/>
+      <w:pPr>
+        <w:ind w:left="4320" w:hanging="360"/>
+      </w:pPr>
+      <w:rPr>
+        <w:rFonts w:ascii="Wingdings" w:hAnsi="Wingdings" w:hint="default"/>
+      </w:rPr>
+    </w:lvl>
+    <w:lvl w:ilvl="6" w:tplc="04090001" w:tentative="1">
+      <w:start w:val="1"/>
+      <w:numFmt w:val="bullet"/>
+      <w:lvlText w:val=""/>
+      <w:lvlJc w:val="left"/>
+      <w:pPr>
+        <w:ind w:left="5040" w:hanging="360"/>
+      </w:pPr>
+      <w:rPr>
+        <w:rFonts w:ascii="Symbol" w:hAnsi="Symbol" w:hint="default"/>
+      </w:rPr>
+    </w:lvl>
+    <w:lvl w:ilvl="7" w:tplc="04090003" w:tentative="1">
+      <w:start w:val="1"/>
+      <w:numFmt w:val="bullet"/>
+      <w:lvlText w:val="o"/>
+      <w:lvlJc w:val="left"/>
+      <w:pPr>
+        <w:ind w:left="5760" w:hanging="360"/>
+      </w:pPr>
+      <w:rPr>
+        <w:rFonts w:ascii="Courier New" w:hAnsi="Courier New" w:cs="Courier New" w:hint="default"/>
+      </w:rPr>
+    </w:lvl>
+    <w:lvl w:ilvl="8" w:tplc="04090005" w:tentative="1">
+      <w:start w:val="1"/>
+      <w:numFmt w:val="bullet"/>
+      <w:lvlText w:val=""/>
+      <w:lvlJc w:val="left"/>
+      <w:pPr>
+        <w:ind w:left="6480" w:hanging="360"/>
+      </w:pPr>
+      <w:rPr>
+        <w:rFonts w:ascii="Wingdings" w:hAnsi="Wingdings" w:hint="default"/>
+      </w:rPr>
+    </w:lvl>
+  </w:abstractNum>
+  <w:num w:numId="1" w16cid:durableId="55904531">
+    <w:abstractNumId w:val="0"/>
+  </w:num>
+</w:numbering>
 </file>
 
 <file path=word/styles.xml><?xml version="1.0" encoding="utf-8"?>
@@ -7396,6 +7694,22 @@
       <w:spacing w:val="5"/>
     </w:rPr>
   </w:style>
+  <w:style w:type="paragraph" w:styleId="NormalWeb">
+    <w:name w:val="Normal (Web)"/>
+    <w:basedOn w:val="Normal"/>
+    <w:uiPriority w:val="99"/>
+    <w:semiHidden/>
+    <w:unhideWhenUsed/>
+    <w:rsid w:val="00FD3506"/>
+    <w:pPr>
+      <w:spacing w:before="100" w:beforeAutospacing="1" w:after="100" w:afterAutospacing="1" w:line="240" w:lineRule="auto"/>
+    </w:pPr>
+    <w:rPr>
+      <w:rFonts w:ascii="Times New Roman" w:eastAsia="Times New Roman" w:hAnsi="Times New Roman" w:cs="Times New Roman"/>
+      <w:kern w:val="0"/>
+      <w14:ligatures w14:val="none"/>
+    </w:rPr>
+  </w:style>
 </w:styles>
 </file>
 

</xml_diff>